<commit_message>
chore: user manual overhaul, screenshots, and staff activity fixes
- Rename platform from PharmaConnect to APOTEKH throughout user-manual.md
- Fix subscription tiers: ESSENTIAL → BASIC, correct user counts, remove HYBRID pricing
- Mark Clinical Decision Support as never tier-gated across all tiers
- Mark CPD Tracker as Coming Soon (Phase 2)
- Delete stale .docx copies; regenerate user-manual.docx with embedded screenshots
- Capture 27 app screenshots via headless browser into docs/screenshots/
- Staff Activity: fix Tsh currency formatting, collapse detail panel by default,
  add toggle/close behaviour, annotate PIN override threshold, confirm login timestamp comments

Co-Authored-By: Claude Sonnet 4.6 <noreply@anthropic.com>
</commit_message>
<xml_diff>
--- a/PharmaConnect Main/PharmaConnect_Pitch_Document.docx
+++ b/PharmaConnect Main/PharmaConnect_Pitch_Document.docx
@@ -2009,7 +2009,7 @@
         <w:spacing w:after="140"/>
       </w:pPr>
       <w:r>
-        <w:t>At 500 active pharmacies across a blended average of TZS 65,000 per month, monthly recurring revenue reaches TZS 32.5 million (~USD 12,500). At 1,000 pharmacies the figure doubles. These are conservative targets given a total addressable market of 8,500 facilities.</w:t>
+        <w:t>At 500 active pharmacies across a blended average of Tsh 65,000 per month, monthly recurring revenue reaches Tsh 32.5 million (~USD 12,500). At 1,000 pharmacies the figure doubles. These are conservative targets given a total addressable market of 8,500 facilities.</w:t>
       </w:r>
     </w:p>
     <w:p>
@@ -2145,7 +2145,7 @@
                 <w:sz w:val="20"/>
                 <w:szCs w:val="20"/>
               </w:rPr>
-              <w:t>Monthly (TZS)</w:t>
+              <w:t>Monthly (Tsh)</w:t>
             </w:r>
           </w:p>
         </w:tc>
@@ -2179,7 +2179,7 @@
                 <w:sz w:val="20"/>
                 <w:szCs w:val="20"/>
               </w:rPr>
-              <w:t>Annual (TZS)</w:t>
+              <w:t>Annual (Tsh)</w:t>
             </w:r>
           </w:p>
         </w:tc>
@@ -5338,7 +5338,7 @@
                 <w:sz w:val="20"/>
                 <w:szCs w:val="20"/>
               </w:rPr>
-              <w:t>TZS currency, TMDA regulatory framework, NEMLIT drug classification, AWaRe antibiotics, NHIF/UHI data structure — no imported system offers this</w:t>
+              <w:t>Tsh currency, TMDA regulatory framework, NEMLIT drug classification, AWaRe antibiotics, NHIF/UHI data structure — no imported system offers this</w:t>
             </w:r>
           </w:p>
         </w:tc>

</xml_diff>